<commit_message>
style(ui): Fix text overlap inside speedometer dials and add pod status icons
</commit_message>
<xml_diff>
--- a/docs/ProjectPulse_Product_Capabilities.docx
+++ b/docs/ProjectPulse_Product_Capabilities.docx
@@ -162,7 +162,7 @@
                 <w:color w:val="1C1C1E"/>
                 <w:sz w:val="20"/>
               </w:rPr>
-              <w:t>15 June 2026</w:t>
+              <w:t>21 June 2026</w:t>
             </w:r>
           </w:p>
           <w:p>
@@ -3152,7 +3152,7 @@
                 <w:color w:val="1C1C1E"/>
                 <w:sz w:val="19"/>
               </w:rPr>
-              <w:t>Immutable activity stream with full diff payloads and session rollback.</w:t>
+              <w:t>Immutable activity stream with before/after diff payloads for traceability.</w:t>
             </w:r>
           </w:p>
         </w:tc>
@@ -4171,6 +4171,85 @@
         <w:t>The Insights module transforms raw task and effort data into the industry-standard Earned Value Management (EVM) metric suite — Planned Value, Earned Value, Schedule Variance, and Cost Performance Index — updated in real time. A burn-up chart projects the exact week of project completion based on rolling 3-week velocity, giving management an evidence-based delivery forecast.</w:t>
       </w:r>
     </w:p>
+    <w:tbl>
+      <w:tblPr>
+        <w:tblW w:type="auto" w:w="0"/>
+        <w:jc w:val="center"/>
+        <w:tblLook w:firstColumn="1" w:firstRow="1" w:lastColumn="0" w:lastRow="0" w:noHBand="0" w:noVBand="1" w:val="04A0"/>
+      </w:tblPr>
+      <w:tblGrid>
+        <w:gridCol w:w="8640"/>
+      </w:tblGrid>
+      <w:tr>
+        <w:tc>
+          <w:tcPr>
+            <w:tcW w:type="dxa" w:w="8640"/>
+            <w:shd w:val="clear" w:color="auto" w:fill="FFFFFF"/>
+            <w:tcBorders>
+              <w:top w:val="single" w:sz="4" w:color="E2E8F0"/>
+              <w:bottom w:val="single" w:sz="4" w:color="E2E8F0"/>
+              <w:left w:val="single" w:sz="4" w:color="E2E8F0"/>
+              <w:right w:val="single" w:sz="4" w:color="E2E8F0"/>
+            </w:tcBorders>
+          </w:tcPr>
+          <w:p>
+            <w:pPr>
+              <w:spacing w:before="120" w:after="120"/>
+              <w:jc w:val="center"/>
+            </w:pPr>
+            <w:r>
+              <w:drawing>
+                <wp:inline xmlns:a="http://schemas.openxmlformats.org/drawingml/2006/main" xmlns:pic="http://schemas.openxmlformats.org/drawingml/2006/picture">
+                  <wp:extent cx="5577840" cy="3137535"/>
+                  <wp:docPr id="3" name="Picture 3"/>
+                  <wp:cNvGraphicFramePr>
+                    <a:graphicFrameLocks noChangeAspect="1"/>
+                  </wp:cNvGraphicFramePr>
+                  <a:graphic>
+                    <a:graphicData uri="http://schemas.openxmlformats.org/drawingml/2006/picture">
+                      <pic:pic>
+                        <pic:nvPicPr>
+                          <pic:cNvPr id="0" name="01b_insights_analytics.png"/>
+                          <pic:cNvPicPr/>
+                        </pic:nvPicPr>
+                        <pic:blipFill>
+                          <a:blip r:embed="rId12"/>
+                          <a:stretch>
+                            <a:fillRect/>
+                          </a:stretch>
+                        </pic:blipFill>
+                        <pic:spPr>
+                          <a:xfrm>
+                            <a:off x="0" y="0"/>
+                            <a:ext cx="5577840" cy="3137535"/>
+                          </a:xfrm>
+                          <a:prstGeom prst="rect"/>
+                        </pic:spPr>
+                      </pic:pic>
+                    </a:graphicData>
+                  </a:graphic>
+                </wp:inline>
+              </w:drawing>
+            </w:r>
+          </w:p>
+        </w:tc>
+      </w:tr>
+    </w:tbl>
+    <w:p>
+      <w:pPr>
+        <w:spacing w:before="80" w:after="280"/>
+        <w:jc w:val="center"/>
+      </w:pPr>
+      <w:r>
+        <w:rPr>
+          <w:rFonts w:ascii="Segoe UI" w:hAnsi="Segoe UI"/>
+          <w:i/>
+          <w:color w:val="6C757D"/>
+          <w:sz w:val="18"/>
+        </w:rPr>
+        <w:t>Figure 2.2 — Live Insights: EVM Performance Metrics, Burn-up Chart, and Weekly Velocity</w:t>
+      </w:r>
+    </w:p>
     <w:p/>
     <w:p>
       <w:pPr>
@@ -4228,7 +4307,7 @@
               <w:drawing>
                 <wp:inline xmlns:a="http://schemas.openxmlformats.org/drawingml/2006/main" xmlns:pic="http://schemas.openxmlformats.org/drawingml/2006/picture">
                   <wp:extent cx="5577840" cy="3137535"/>
-                  <wp:docPr id="3" name="Picture 3"/>
+                  <wp:docPr id="4" name="Picture 4"/>
                   <wp:cNvGraphicFramePr>
                     <a:graphicFrameLocks noChangeAspect="1"/>
                   </wp:cNvGraphicFramePr>
@@ -4240,7 +4319,7 @@
                           <pic:cNvPicPr/>
                         </pic:nvPicPr>
                         <pic:blipFill>
-                          <a:blip r:embed="rId12"/>
+                          <a:blip r:embed="rId13"/>
                           <a:stretch>
                             <a:fillRect/>
                           </a:stretch>
@@ -4334,7 +4413,7 @@
               <w:drawing>
                 <wp:inline xmlns:a="http://schemas.openxmlformats.org/drawingml/2006/main" xmlns:pic="http://schemas.openxmlformats.org/drawingml/2006/picture">
                   <wp:extent cx="5577840" cy="3137535"/>
-                  <wp:docPr id="4" name="Picture 4"/>
+                  <wp:docPr id="5" name="Picture 5"/>
                   <wp:cNvGraphicFramePr>
                     <a:graphicFrameLocks noChangeAspect="1"/>
                   </wp:cNvGraphicFramePr>
@@ -4346,7 +4425,7 @@
                           <pic:cNvPicPr/>
                         </pic:nvPicPr>
                         <pic:blipFill>
-                          <a:blip r:embed="rId13"/>
+                          <a:blip r:embed="rId14"/>
                           <a:stretch>
                             <a:fillRect/>
                           </a:stretch>
@@ -4440,7 +4519,7 @@
               <w:drawing>
                 <wp:inline xmlns:a="http://schemas.openxmlformats.org/drawingml/2006/main" xmlns:pic="http://schemas.openxmlformats.org/drawingml/2006/picture">
                   <wp:extent cx="5577840" cy="3137535"/>
-                  <wp:docPr id="5" name="Picture 5"/>
+                  <wp:docPr id="6" name="Picture 6"/>
                   <wp:cNvGraphicFramePr>
                     <a:graphicFrameLocks noChangeAspect="1"/>
                   </wp:cNvGraphicFramePr>
@@ -4452,7 +4531,7 @@
                           <pic:cNvPicPr/>
                         </pic:nvPicPr>
                         <pic:blipFill>
-                          <a:blip r:embed="rId14"/>
+                          <a:blip r:embed="rId15"/>
                           <a:stretch>
                             <a:fillRect/>
                           </a:stretch>
@@ -4546,7 +4625,7 @@
               <w:drawing>
                 <wp:inline xmlns:a="http://schemas.openxmlformats.org/drawingml/2006/main" xmlns:pic="http://schemas.openxmlformats.org/drawingml/2006/picture">
                   <wp:extent cx="5577840" cy="3137535"/>
-                  <wp:docPr id="6" name="Picture 6"/>
+                  <wp:docPr id="7" name="Picture 7"/>
                   <wp:cNvGraphicFramePr>
                     <a:graphicFrameLocks noChangeAspect="1"/>
                   </wp:cNvGraphicFramePr>
@@ -4558,7 +4637,7 @@
                           <pic:cNvPicPr/>
                         </pic:nvPicPr>
                         <pic:blipFill>
-                          <a:blip r:embed="rId14"/>
+                          <a:blip r:embed="rId15"/>
                           <a:stretch>
                             <a:fillRect/>
                           </a:stretch>
@@ -4652,7 +4731,7 @@
               <w:drawing>
                 <wp:inline xmlns:a="http://schemas.openxmlformats.org/drawingml/2006/main" xmlns:pic="http://schemas.openxmlformats.org/drawingml/2006/picture">
                   <wp:extent cx="5577840" cy="3137535"/>
-                  <wp:docPr id="7" name="Picture 7"/>
+                  <wp:docPr id="8" name="Picture 8"/>
                   <wp:cNvGraphicFramePr>
                     <a:graphicFrameLocks noChangeAspect="1"/>
                   </wp:cNvGraphicFramePr>
@@ -4664,7 +4743,7 @@
                           <pic:cNvPicPr/>
                         </pic:nvPicPr>
                         <pic:blipFill>
-                          <a:blip r:embed="rId15"/>
+                          <a:blip r:embed="rId16"/>
                           <a:stretch>
                             <a:fillRect/>
                           </a:stretch>
@@ -4758,7 +4837,7 @@
               <w:drawing>
                 <wp:inline xmlns:a="http://schemas.openxmlformats.org/drawingml/2006/main" xmlns:pic="http://schemas.openxmlformats.org/drawingml/2006/picture">
                   <wp:extent cx="5577840" cy="3137535"/>
-                  <wp:docPr id="8" name="Picture 8"/>
+                  <wp:docPr id="9" name="Picture 9"/>
                   <wp:cNvGraphicFramePr>
                     <a:graphicFrameLocks noChangeAspect="1"/>
                   </wp:cNvGraphicFramePr>
@@ -4770,7 +4849,7 @@
                           <pic:cNvPicPr/>
                         </pic:nvPicPr>
                         <pic:blipFill>
-                          <a:blip r:embed="rId16"/>
+                          <a:blip r:embed="rId17"/>
                           <a:stretch>
                             <a:fillRect/>
                           </a:stretch>
@@ -4864,7 +4943,7 @@
               <w:drawing>
                 <wp:inline xmlns:a="http://schemas.openxmlformats.org/drawingml/2006/main" xmlns:pic="http://schemas.openxmlformats.org/drawingml/2006/picture">
                   <wp:extent cx="5577840" cy="3137535"/>
-                  <wp:docPr id="9" name="Picture 9"/>
+                  <wp:docPr id="10" name="Picture 10"/>
                   <wp:cNvGraphicFramePr>
                     <a:graphicFrameLocks noChangeAspect="1"/>
                   </wp:cNvGraphicFramePr>
@@ -4876,7 +4955,7 @@
                           <pic:cNvPicPr/>
                         </pic:nvPicPr>
                         <pic:blipFill>
-                          <a:blip r:embed="rId17"/>
+                          <a:blip r:embed="rId18"/>
                           <a:stretch>
                             <a:fillRect/>
                           </a:stretch>
@@ -4922,7 +5001,7 @@
         <w:drawing>
           <wp:inline xmlns:a="http://schemas.openxmlformats.org/drawingml/2006/main" xmlns:pic="http://schemas.openxmlformats.org/drawingml/2006/picture">
             <wp:extent cx="5760720" cy="3215286"/>
-            <wp:docPr id="10" name="Picture 10"/>
+            <wp:docPr id="11" name="Picture 11"/>
             <wp:cNvGraphicFramePr>
               <a:graphicFrameLocks noChangeAspect="1"/>
             </wp:cNvGraphicFramePr>
@@ -4934,7 +5013,7 @@
                     <pic:cNvPicPr/>
                   </pic:nvPicPr>
                   <pic:blipFill>
-                    <a:blip r:embed="rId18"/>
+                    <a:blip r:embed="rId19"/>
                     <a:stretch>
                       <a:fillRect/>
                     </a:stretch>
@@ -4992,7 +5071,7 @@
           <w:rFonts w:ascii="Segoe UI" w:hAnsi="Segoe UI"/>
           <w:sz w:val="21"/>
         </w:rPr>
-        <w:t>Every state mutation — task creation, status change, RAID update, member modification — is captured in an immutable, timestamped audit log with full before/after diff payloads. Teams can trace any change back to who made it, when, and why. Full session rollback to any prior state is available in one click.</w:t>
+        <w:t>Every state mutation — task creation, status change, RAID update, member modification — is captured in an immutable, timestamped audit log with full before/after diff payloads. Teams can trace any change back to who made it, when, and why, allowing manual recovery if needed.</w:t>
       </w:r>
     </w:p>
     <w:tbl>
@@ -5025,7 +5104,7 @@
               <w:drawing>
                 <wp:inline xmlns:a="http://schemas.openxmlformats.org/drawingml/2006/main" xmlns:pic="http://schemas.openxmlformats.org/drawingml/2006/picture">
                   <wp:extent cx="5577840" cy="3137535"/>
-                  <wp:docPr id="11" name="Picture 11"/>
+                  <wp:docPr id="12" name="Picture 12"/>
                   <wp:cNvGraphicFramePr>
                     <a:graphicFrameLocks noChangeAspect="1"/>
                   </wp:cNvGraphicFramePr>
@@ -5037,7 +5116,7 @@
                           <pic:cNvPicPr/>
                         </pic:nvPicPr>
                         <pic:blipFill>
-                          <a:blip r:embed="rId19"/>
+                          <a:blip r:embed="rId20"/>
                           <a:stretch>
                             <a:fillRect/>
                           </a:stretch>
@@ -5158,7 +5237,7 @@
               <w:drawing>
                 <wp:inline xmlns:a="http://schemas.openxmlformats.org/drawingml/2006/main" xmlns:pic="http://schemas.openxmlformats.org/drawingml/2006/picture">
                   <wp:extent cx="5577840" cy="3137535"/>
-                  <wp:docPr id="12" name="Picture 12"/>
+                  <wp:docPr id="13" name="Picture 13"/>
                   <wp:cNvGraphicFramePr>
                     <a:graphicFrameLocks noChangeAspect="1"/>
                   </wp:cNvGraphicFramePr>
@@ -5170,7 +5249,7 @@
                           <pic:cNvPicPr/>
                         </pic:nvPicPr>
                         <pic:blipFill>
-                          <a:blip r:embed="rId20"/>
+                          <a:blip r:embed="rId21"/>
                           <a:stretch>
                             <a:fillRect/>
                           </a:stretch>
@@ -8425,7 +8504,7 @@
               <w:drawing>
                 <wp:inline xmlns:a="http://schemas.openxmlformats.org/drawingml/2006/main" xmlns:pic="http://schemas.openxmlformats.org/drawingml/2006/picture">
                   <wp:extent cx="5577840" cy="3137535"/>
-                  <wp:docPr id="13" name="Picture 13"/>
+                  <wp:docPr id="14" name="Picture 14"/>
                   <wp:cNvGraphicFramePr>
                     <a:graphicFrameLocks noChangeAspect="1"/>
                   </wp:cNvGraphicFramePr>
@@ -8504,7 +8583,7 @@
               <w:drawing>
                 <wp:inline xmlns:a="http://schemas.openxmlformats.org/drawingml/2006/main" xmlns:pic="http://schemas.openxmlformats.org/drawingml/2006/picture">
                   <wp:extent cx="5577840" cy="3137535"/>
-                  <wp:docPr id="14" name="Picture 14"/>
+                  <wp:docPr id="15" name="Picture 15"/>
                   <wp:cNvGraphicFramePr>
                     <a:graphicFrameLocks noChangeAspect="1"/>
                   </wp:cNvGraphicFramePr>
@@ -8516,7 +8595,7 @@
                           <pic:cNvPicPr/>
                         </pic:nvPicPr>
                         <pic:blipFill>
-                          <a:blip r:embed="rId12"/>
+                          <a:blip r:embed="rId13"/>
                           <a:stretch>
                             <a:fillRect/>
                           </a:stretch>
@@ -8583,7 +8662,7 @@
               <w:drawing>
                 <wp:inline xmlns:a="http://schemas.openxmlformats.org/drawingml/2006/main" xmlns:pic="http://schemas.openxmlformats.org/drawingml/2006/picture">
                   <wp:extent cx="5577840" cy="3137535"/>
-                  <wp:docPr id="15" name="Picture 15"/>
+                  <wp:docPr id="16" name="Picture 16"/>
                   <wp:cNvGraphicFramePr>
                     <a:graphicFrameLocks noChangeAspect="1"/>
                   </wp:cNvGraphicFramePr>
@@ -8595,7 +8674,7 @@
                           <pic:cNvPicPr/>
                         </pic:nvPicPr>
                         <pic:blipFill>
-                          <a:blip r:embed="rId13"/>
+                          <a:blip r:embed="rId14"/>
                           <a:stretch>
                             <a:fillRect/>
                           </a:stretch>
@@ -8662,7 +8741,7 @@
               <w:drawing>
                 <wp:inline xmlns:a="http://schemas.openxmlformats.org/drawingml/2006/main" xmlns:pic="http://schemas.openxmlformats.org/drawingml/2006/picture">
                   <wp:extent cx="5577840" cy="3137535"/>
-                  <wp:docPr id="16" name="Picture 16"/>
+                  <wp:docPr id="17" name="Picture 17"/>
                   <wp:cNvGraphicFramePr>
                     <a:graphicFrameLocks noChangeAspect="1"/>
                   </wp:cNvGraphicFramePr>
@@ -8674,7 +8753,7 @@
                           <pic:cNvPicPr/>
                         </pic:nvPicPr>
                         <pic:blipFill>
-                          <a:blip r:embed="rId14"/>
+                          <a:blip r:embed="rId15"/>
                           <a:stretch>
                             <a:fillRect/>
                           </a:stretch>
@@ -8741,7 +8820,7 @@
               <w:drawing>
                 <wp:inline xmlns:a="http://schemas.openxmlformats.org/drawingml/2006/main" xmlns:pic="http://schemas.openxmlformats.org/drawingml/2006/picture">
                   <wp:extent cx="5577840" cy="3137535"/>
-                  <wp:docPr id="17" name="Picture 17"/>
+                  <wp:docPr id="18" name="Picture 18"/>
                   <wp:cNvGraphicFramePr>
                     <a:graphicFrameLocks noChangeAspect="1"/>
                   </wp:cNvGraphicFramePr>
@@ -8753,7 +8832,7 @@
                           <pic:cNvPicPr/>
                         </pic:nvPicPr>
                         <pic:blipFill>
-                          <a:blip r:embed="rId14"/>
+                          <a:blip r:embed="rId15"/>
                           <a:stretch>
                             <a:fillRect/>
                           </a:stretch>
@@ -8820,7 +8899,7 @@
               <w:drawing>
                 <wp:inline xmlns:a="http://schemas.openxmlformats.org/drawingml/2006/main" xmlns:pic="http://schemas.openxmlformats.org/drawingml/2006/picture">
                   <wp:extent cx="5577840" cy="3137535"/>
-                  <wp:docPr id="18" name="Picture 18"/>
+                  <wp:docPr id="19" name="Picture 19"/>
                   <wp:cNvGraphicFramePr>
                     <a:graphicFrameLocks noChangeAspect="1"/>
                   </wp:cNvGraphicFramePr>
@@ -8832,7 +8911,7 @@
                           <pic:cNvPicPr/>
                         </pic:nvPicPr>
                         <pic:blipFill>
-                          <a:blip r:embed="rId15"/>
+                          <a:blip r:embed="rId16"/>
                           <a:stretch>
                             <a:fillRect/>
                           </a:stretch>
@@ -8899,7 +8978,7 @@
               <w:drawing>
                 <wp:inline xmlns:a="http://schemas.openxmlformats.org/drawingml/2006/main" xmlns:pic="http://schemas.openxmlformats.org/drawingml/2006/picture">
                   <wp:extent cx="5577840" cy="3137535"/>
-                  <wp:docPr id="19" name="Picture 19"/>
+                  <wp:docPr id="20" name="Picture 20"/>
                   <wp:cNvGraphicFramePr>
                     <a:graphicFrameLocks noChangeAspect="1"/>
                   </wp:cNvGraphicFramePr>
@@ -8911,7 +8990,7 @@
                           <pic:cNvPicPr/>
                         </pic:nvPicPr>
                         <pic:blipFill>
-                          <a:blip r:embed="rId16"/>
+                          <a:blip r:embed="rId17"/>
                           <a:stretch>
                             <a:fillRect/>
                           </a:stretch>
@@ -8978,7 +9057,7 @@
               <w:drawing>
                 <wp:inline xmlns:a="http://schemas.openxmlformats.org/drawingml/2006/main" xmlns:pic="http://schemas.openxmlformats.org/drawingml/2006/picture">
                   <wp:extent cx="5577840" cy="3137535"/>
-                  <wp:docPr id="20" name="Picture 20"/>
+                  <wp:docPr id="21" name="Picture 21"/>
                   <wp:cNvGraphicFramePr>
                     <a:graphicFrameLocks noChangeAspect="1"/>
                   </wp:cNvGraphicFramePr>
@@ -8990,7 +9069,7 @@
                           <pic:cNvPicPr/>
                         </pic:nvPicPr>
                         <pic:blipFill>
-                          <a:blip r:embed="rId17"/>
+                          <a:blip r:embed="rId18"/>
                           <a:stretch>
                             <a:fillRect/>
                           </a:stretch>
@@ -9057,7 +9136,7 @@
               <w:drawing>
                 <wp:inline xmlns:a="http://schemas.openxmlformats.org/drawingml/2006/main" xmlns:pic="http://schemas.openxmlformats.org/drawingml/2006/picture">
                   <wp:extent cx="5577840" cy="3137535"/>
-                  <wp:docPr id="21" name="Picture 21"/>
+                  <wp:docPr id="22" name="Picture 22"/>
                   <wp:cNvGraphicFramePr>
                     <a:graphicFrameLocks noChangeAspect="1"/>
                   </wp:cNvGraphicFramePr>
@@ -9069,7 +9148,7 @@
                           <pic:cNvPicPr/>
                         </pic:nvPicPr>
                         <pic:blipFill>
-                          <a:blip r:embed="rId19"/>
+                          <a:blip r:embed="rId20"/>
                           <a:stretch>
                             <a:fillRect/>
                           </a:stretch>
@@ -9136,7 +9215,7 @@
               <w:drawing>
                 <wp:inline xmlns:a="http://schemas.openxmlformats.org/drawingml/2006/main" xmlns:pic="http://schemas.openxmlformats.org/drawingml/2006/picture">
                   <wp:extent cx="5577840" cy="3137535"/>
-                  <wp:docPr id="22" name="Picture 22"/>
+                  <wp:docPr id="23" name="Picture 23"/>
                   <wp:cNvGraphicFramePr>
                     <a:graphicFrameLocks noChangeAspect="1"/>
                   </wp:cNvGraphicFramePr>
@@ -9148,7 +9227,7 @@
                           <pic:cNvPicPr/>
                         </pic:nvPicPr>
                         <pic:blipFill>
-                          <a:blip r:embed="rId20"/>
+                          <a:blip r:embed="rId21"/>
                           <a:stretch>
                             <a:fillRect/>
                           </a:stretch>

</xml_diff>

<commit_message>
feat: make exported Gantt chart report interactive with CRUD modals and file system save
</commit_message>
<xml_diff>
--- a/docs/ProjectPulse_Product_Capabilities.docx
+++ b/docs/ProjectPulse_Product_Capabilities.docx
@@ -162,7 +162,7 @@
                 <w:color w:val="1C1C1E"/>
                 <w:sz w:val="20"/>
               </w:rPr>
-              <w:t>21 June 2026</w:t>
+              <w:t>11 July 2026</w:t>
             </w:r>
           </w:p>
           <w:p>
@@ -4633,11 +4633,11 @@
                     <a:graphicData uri="http://schemas.openxmlformats.org/drawingml/2006/picture">
                       <pic:pic>
                         <pic:nvPicPr>
-                          <pic:cNvPr id="0" name="04_weekly_scheduler.png"/>
+                          <pic:cNvPr id="0" name="05_raid_register.png"/>
                           <pic:cNvPicPr/>
                         </pic:nvPicPr>
                         <pic:blipFill>
-                          <a:blip r:embed="rId15"/>
+                          <a:blip r:embed="rId16"/>
                           <a:stretch>
                             <a:fillRect/>
                           </a:stretch>
@@ -4743,7 +4743,7 @@
                           <pic:cNvPicPr/>
                         </pic:nvPicPr>
                         <pic:blipFill>
-                          <a:blip r:embed="rId16"/>
+                          <a:blip r:embed="rId17"/>
                           <a:stretch>
                             <a:fillRect/>
                           </a:stretch>
@@ -4849,7 +4849,7 @@
                           <pic:cNvPicPr/>
                         </pic:nvPicPr>
                         <pic:blipFill>
-                          <a:blip r:embed="rId17"/>
+                          <a:blip r:embed="rId18"/>
                           <a:stretch>
                             <a:fillRect/>
                           </a:stretch>
@@ -4955,7 +4955,7 @@
                           <pic:cNvPicPr/>
                         </pic:nvPicPr>
                         <pic:blipFill>
-                          <a:blip r:embed="rId18"/>
+                          <a:blip r:embed="rId19"/>
                           <a:stretch>
                             <a:fillRect/>
                           </a:stretch>
@@ -5013,7 +5013,7 @@
                     <pic:cNvPicPr/>
                   </pic:nvPicPr>
                   <pic:blipFill>
-                    <a:blip r:embed="rId19"/>
+                    <a:blip r:embed="rId20"/>
                     <a:stretch>
                       <a:fillRect/>
                     </a:stretch>
@@ -5116,7 +5116,7 @@
                           <pic:cNvPicPr/>
                         </pic:nvPicPr>
                         <pic:blipFill>
-                          <a:blip r:embed="rId20"/>
+                          <a:blip r:embed="rId21"/>
                           <a:stretch>
                             <a:fillRect/>
                           </a:stretch>
@@ -5249,7 +5249,7 @@
                           <pic:cNvPicPr/>
                         </pic:nvPicPr>
                         <pic:blipFill>
-                          <a:blip r:embed="rId21"/>
+                          <a:blip r:embed="rId22"/>
                           <a:stretch>
                             <a:fillRect/>
                           </a:stretch>
@@ -8828,11 +8828,11 @@
                     <a:graphicData uri="http://schemas.openxmlformats.org/drawingml/2006/picture">
                       <pic:pic>
                         <pic:nvPicPr>
-                          <pic:cNvPr id="0" name="04_weekly_scheduler.png"/>
+                          <pic:cNvPr id="0" name="05_raid_register.png"/>
                           <pic:cNvPicPr/>
                         </pic:nvPicPr>
                         <pic:blipFill>
-                          <a:blip r:embed="rId15"/>
+                          <a:blip r:embed="rId16"/>
                           <a:stretch>
                             <a:fillRect/>
                           </a:stretch>
@@ -8911,7 +8911,7 @@
                           <pic:cNvPicPr/>
                         </pic:nvPicPr>
                         <pic:blipFill>
-                          <a:blip r:embed="rId16"/>
+                          <a:blip r:embed="rId17"/>
                           <a:stretch>
                             <a:fillRect/>
                           </a:stretch>
@@ -8990,7 +8990,7 @@
                           <pic:cNvPicPr/>
                         </pic:nvPicPr>
                         <pic:blipFill>
-                          <a:blip r:embed="rId17"/>
+                          <a:blip r:embed="rId18"/>
                           <a:stretch>
                             <a:fillRect/>
                           </a:stretch>
@@ -9069,7 +9069,7 @@
                           <pic:cNvPicPr/>
                         </pic:nvPicPr>
                         <pic:blipFill>
-                          <a:blip r:embed="rId18"/>
+                          <a:blip r:embed="rId19"/>
                           <a:stretch>
                             <a:fillRect/>
                           </a:stretch>
@@ -9148,7 +9148,7 @@
                           <pic:cNvPicPr/>
                         </pic:nvPicPr>
                         <pic:blipFill>
-                          <a:blip r:embed="rId20"/>
+                          <a:blip r:embed="rId21"/>
                           <a:stretch>
                             <a:fillRect/>
                           </a:stretch>
@@ -9227,7 +9227,7 @@
                           <pic:cNvPicPr/>
                         </pic:nvPicPr>
                         <pic:blipFill>
-                          <a:blip r:embed="rId21"/>
+                          <a:blip r:embed="rId22"/>
                           <a:stretch>
                             <a:fillRect/>
                           </a:stretch>

</xml_diff>